<commit_message>
Add Sova Health achievements to CV and isolate the docx build
Adds the quantified results that were missing: quick-commerce revenue scaled
from ~INR 50 lakh to ~INR 4.3 crore in 8 months, an automation cutting
order-processing turnaround from ~48 hours to ~10 minutes, and a 1,600+ account
portfolio. Confirmed by Aditya as Sova Health work.

The docx build script is CommonJS but the root package declares "type":
"module", so it stopped running once it moved under cv/. Renaming it to .cjs
and giving cv/ its own package.json fixes that and keeps the docx dependency
out of the root package, whose LinkedIn OAuth code is deliberately
dependency-free.

Co-Authored-By: Claude Opus 5 <noreply@anthropic.com>
Claude-Session: https://claude.ai/code/session_01S7AHVAazAp4VVtU7R1DprJ
</commit_message>
<xml_diff>
--- a/cv/Aditya_Kumar_CV.docx
+++ b/cv/Aditya_Kumar_CV.docx
@@ -456,6 +456,44 @@
           <w:sz w:val="18"/>
           <w:szCs w:val="18"/>
         </w:rPr>
+        <w:t xml:space="preserve">Scaled the brand's quick-commerce revenue from approximately INR 50 lakh to INR 4.3 crore in 8 months across Blinkit, Zepto, and Swiggy Instamart.</w:t>
+      </w:r>
+    </w:p>
+    <w:p>
+      <w:pPr>
+        <w:pStyle w:val="ListParagraph"/>
+        <w:numPr>
+          <w:ilvl w:val="0"/>
+          <w:numId w:val="2"/>
+        </w:numPr>
+        <w:spacing w:after="28" w:line="226"/>
+      </w:pPr>
+      <w:r>
+        <w:rPr>
+          <w:rFonts w:ascii="Calibri" w:cs="Calibri" w:eastAsia="Calibri" w:hAnsi="Calibri"/>
+          <w:color w:val="1A1A1A"/>
+          <w:sz w:val="18"/>
+          <w:szCs w:val="18"/>
+        </w:rPr>
+        <w:t xml:space="preserve">Built an automation that cut order-processing turnaround from roughly 48 hours to around 10 minutes.</w:t>
+      </w:r>
+    </w:p>
+    <w:p>
+      <w:pPr>
+        <w:pStyle w:val="ListParagraph"/>
+        <w:numPr>
+          <w:ilvl w:val="0"/>
+          <w:numId w:val="2"/>
+        </w:numPr>
+        <w:spacing w:after="28" w:line="226"/>
+      </w:pPr>
+      <w:r>
+        <w:rPr>
+          <w:rFonts w:ascii="Calibri" w:cs="Calibri" w:eastAsia="Calibri" w:hAnsi="Calibri"/>
+          <w:color w:val="1A1A1A"/>
+          <w:sz w:val="18"/>
+          <w:szCs w:val="18"/>
+        </w:rPr>
         <w:t xml:space="preserve">Served as the dedicated Zoho Manager, customizing workflows in Zoho CRM and Zoconut to track patient lifecycles, automate client follow-ups, and resolve escalations, sustaining a CSAT score of 95% or higher.</w:t>
       </w:r>
     </w:p>
@@ -475,45 +513,26 @@
           <w:sz w:val="18"/>
           <w:szCs w:val="18"/>
         </w:rPr>
-        <w:t xml:space="preserve">Orchestrated end-to-end dispatch of gut microbiome diagnostic kits across PAN India, maintaining an on-time SLA of 98% or better.</w:t>
-      </w:r>
-    </w:p>
-    <w:p>
-      <w:pPr>
-        <w:pStyle w:val="ListParagraph"/>
-        <w:numPr>
-          <w:ilvl w:val="0"/>
-          <w:numId w:val="2"/>
-        </w:numPr>
-        <w:spacing w:after="28" w:line="226"/>
-      </w:pPr>
-      <w:r>
-        <w:rPr>
-          <w:rFonts w:ascii="Calibri" w:cs="Calibri" w:eastAsia="Calibri" w:hAnsi="Calibri"/>
-          <w:color w:val="1A1A1A"/>
-          <w:sz w:val="18"/>
-          <w:szCs w:val="18"/>
-        </w:rPr>
-        <w:t xml:space="preserve">Managed Shopify-based order processing, including inventory reconciliation and refunds.</w:t>
-      </w:r>
-    </w:p>
-    <w:p>
-      <w:pPr>
-        <w:pStyle w:val="ListParagraph"/>
-        <w:numPr>
-          <w:ilvl w:val="0"/>
-          <w:numId w:val="2"/>
-        </w:numPr>
-        <w:spacing w:after="28" w:line="226"/>
-      </w:pPr>
-      <w:r>
-        <w:rPr>
-          <w:rFonts w:ascii="Calibri" w:cs="Calibri" w:eastAsia="Calibri" w:hAnsi="Calibri"/>
-          <w:color w:val="1A1A1A"/>
-          <w:sz w:val="18"/>
-          <w:szCs w:val="18"/>
-        </w:rPr>
-        <w:t xml:space="preserve">Drove inbound and outbound marketplace operations across Amazon, Flipkart, and Blinkit under strict SLA adherence.</w:t>
+        <w:t xml:space="preserve">Managed a client portfolio of 1,600+ accounts alongside end-to-end dispatch of gut microbiome diagnostic kits across PAN India, maintaining an on-time SLA of 98% or better.</w:t>
+      </w:r>
+    </w:p>
+    <w:p>
+      <w:pPr>
+        <w:pStyle w:val="ListParagraph"/>
+        <w:numPr>
+          <w:ilvl w:val="0"/>
+          <w:numId w:val="2"/>
+        </w:numPr>
+        <w:spacing w:after="28" w:line="226"/>
+      </w:pPr>
+      <w:r>
+        <w:rPr>
+          <w:rFonts w:ascii="Calibri" w:cs="Calibri" w:eastAsia="Calibri" w:hAnsi="Calibri"/>
+          <w:color w:val="1A1A1A"/>
+          <w:sz w:val="18"/>
+          <w:szCs w:val="18"/>
+        </w:rPr>
+        <w:t xml:space="preserve">Managed Shopify-based order processing and marketplace operations across Amazon and Flipkart, including inventory reconciliation and refunds.</w:t>
       </w:r>
     </w:p>
     <w:p>

</xml_diff>